<commit_message>
Update tech requirement docx with CyberArk PAM and Github Actions architectural alignments
</commit_message>
<xml_diff>
--- a/docs/requirements/Enterprise_Data_Platform_Technical_Requirements.docx
+++ b/docs/requirements/Enterprise_Data_Platform_Technical_Requirements.docx
@@ -767,7 +767,7 @@
                 <w:sz w:val="20"/>
                 <w:szCs w:val="20"/>
               </w:rPr>
-              <w:t xml:space="preserve">Stored in Vault, rotated 90 days, per-environment unique</w:t>
+              <w:t>Stored in CyberArk PAM, rotated 90 days, per-environment unique</w:t>
             </w:r>
           </w:p>
         </w:tc>
@@ -7248,7 +7248,7 @@
                 <w:sz w:val="20"/>
                 <w:szCs w:val="20"/>
               </w:rPr>
-              <w:t xml:space="preserve">Jenkins HA</w:t>
+              <w:t>GitHub Actions</w:t>
             </w:r>
           </w:p>
         </w:tc>
@@ -7366,7 +7366,7 @@
                 <w:sz w:val="20"/>
                 <w:szCs w:val="20"/>
               </w:rPr>
-              <w:t xml:space="preserve">Vault</w:t>
+              <w:t>CyberArk PAM</w:t>
             </w:r>
           </w:p>
         </w:tc>
@@ -9258,7 +9258,7 @@
                 <w:sz w:val="20"/>
                 <w:szCs w:val="20"/>
               </w:rPr>
-              <w:t xml:space="preserve">SHA-256 one-way hash or Vault token</w:t>
+              <w:t>SHA-256 one-way hash or CyberArk PAM token</w:t>
             </w:r>
           </w:p>
         </w:tc>
@@ -13063,7 +13063,7 @@
                 <w:sz w:val="20"/>
                 <w:szCs w:val="20"/>
               </w:rPr>
-              <w:t xml:space="preserve">Jenkins, artifact repo, GitLab</w:t>
+              <w:t>GitHub Actions, artifact repo, GitLab</w:t>
             </w:r>
           </w:p>
         </w:tc>
@@ -14095,7 +14095,7 @@
                 <w:sz w:val="20"/>
                 <w:szCs w:val="20"/>
               </w:rPr>
-              <w:t xml:space="preserve">Internal CA (Vault PKI)</w:t>
+              <w:t>Internal CA (CyberArk PAM PKI)</w:t>
             </w:r>
           </w:p>
         </w:tc>
@@ -14273,7 +14273,7 @@
                 <w:sz w:val="20"/>
                 <w:szCs w:val="20"/>
               </w:rPr>
-              <w:t xml:space="preserve">Vault CA or database native certs</w:t>
+              <w:t>CyberArk PAM CA or database native certs</w:t>
             </w:r>
           </w:p>
         </w:tc>
@@ -16371,7 +16371,7 @@
                 <w:sz w:val="20"/>
                 <w:szCs w:val="20"/>
               </w:rPr>
-              <w:t xml:space="preserve">Request via Vault + jira approval + auto-expire</w:t>
+              <w:t>Request via CyberArk PAM + jira approval + auto-expire</w:t>
             </w:r>
           </w:p>
         </w:tc>
@@ -16733,7 +16733,7 @@
                 <w:sz w:val="20"/>
                 <w:szCs w:val="20"/>
               </w:rPr>
-              <w:t xml:space="preserve">All Kubernetes namespaces, DB admin, Vault</w:t>
+              <w:t>All Kubernetes namespaces, DB admin, CyberArk PAM</w:t>
             </w:r>
           </w:p>
         </w:tc>
@@ -16969,7 +16969,7 @@
                 <w:sz w:val="20"/>
                 <w:szCs w:val="20"/>
               </w:rPr>
-              <w:t xml:space="preserve">All databases, Vault DB credentials</w:t>
+              <w:t>All databases, CyberArk PAM DB credentials</w:t>
             </w:r>
           </w:p>
         </w:tc>
@@ -17546,7 +17546,7 @@
                 <w:sz w:val="20"/>
                 <w:szCs w:val="20"/>
               </w:rPr>
-              <w:t xml:space="preserve">Vault token</w:t>
+              <w:t>CyberArk PAM token</w:t>
             </w:r>
           </w:p>
         </w:tc>

</xml_diff>

<commit_message>
Update docs covering Isolated VM Configuration (parameters.json and deploy_isolated_vm.sh mappings)
</commit_message>
<xml_diff>
--- a/docs/requirements/Enterprise_Data_Platform_Technical_Requirements.docx
+++ b/docs/requirements/Enterprise_Data_Platform_Technical_Requirements.docx
@@ -18767,6 +18767,70 @@
 3. Create runbooks for each disaster recovery scenario
 4. Establish monitoring baselines and SLA targets
 5. Schedule quarterly architecture review meetings</w:t>
+      </w:r>
+    </w:p>
+    <w:p>
+      <w:r>
+        <w:rPr>
+          <w:b/>
+        </w:rPr>
+        <w:t>SECTION 11: ISOLATED PRODUCTION VM DEPLOYMENT (DYNAMIC ORCHESTRATION)</w:t>
+      </w:r>
+    </w:p>
+    <w:p>
+      <w:r>
+        <w:t>For high-security isolated environments lacking interactive access, the platform incorporates a pre-configured dynamic provisioning workflow.</w:t>
+      </w:r>
+    </w:p>
+    <w:p>
+      <w:r>
+        <w:rPr>
+          <w:b/>
+        </w:rPr>
+        <w:t>11.1 Dynamic Parameterization (parameters.json)</w:t>
+      </w:r>
+    </w:p>
+    <w:p>
+      <w:r>
+        <w:t>The architecture utilizes a strict, declarative JSON configuration store (config/parameters.json) dictating the exact scaling definitions (Replica Counts), Environment Identifiers, Dependency Versions (Python 3.10 and OpenJDK-17), and specific mapped port exposes prior to initialization. This isolates deployment logics from infrastructure limits directly translating to highly secure on-prem server management.</w:t>
+      </w:r>
+    </w:p>
+    <w:p>
+      <w:r>
+        <w:rPr>
+          <w:b/>
+        </w:rPr>
+        <w:t>11.2 Automated Isolated Linux Bootstrapping</w:t>
+      </w:r>
+    </w:p>
+    <w:p>
+      <w:r>
+        <w:t xml:space="preserve">A single executed deployment workflow (deploy_isolated_vm.sh) handles complete orchestration: It parses JSON directives, automatically fetches underlying systems (Docker, Kubectl, Minikube), initiates automated integration testing via Python pipelines natively, and executes Kubernetes Deployment YAMLs mapped seamlessly to parameter specifications. </w:t>
+      </w:r>
+    </w:p>
+    <w:p>
+      <w:r>
+        <w:t>Dynamic orchestration defaults bind natively to specific enterprise sub-domains:</w:t>
+      </w:r>
+    </w:p>
+    <w:p>
+      <w:r>
+        <w:t xml:space="preserve"> - API Dashboard Interface: Exposed via NodePort on 30080.</w:t>
+      </w:r>
+    </w:p>
+    <w:p>
+      <w:r>
+        <w:t xml:space="preserve"> - Spark Execution UI: Mapped locally mapped scaling on 34040.</w:t>
+      </w:r>
+    </w:p>
+    <w:p>
+      <w:r>
+        <w:t xml:space="preserve"> - Spark History Server: Exposed natively via 31808.</w:t>
+      </w:r>
+    </w:p>
+    <w:p>
+      <w:r>
+        <w:t xml:space="preserve"> - Dynatrace ActiveGate Logs: Secure tunneling through 30999.</w:t>
       </w:r>
     </w:p>
     <w:sectPr>

</xml_diff>